<commit_message>
audit: Training Science — 6 fix EMG + balance ratios + pattern isolation
Fix matrice EMG con fonti bibliografiche:
- PUSH_V → PETTO 0.2 (clavicular head, Trebs 2010)
- PULL_H → AVAMBRACCI 0.4→0.7 (grip 50-70% MVC, Contreras 2010)
- SQUAT → POLPACCI 0.2→0.4 (soleus stabilizzazione, Ebben 2009)
- HINGE → DORSALI 0.4→0.7 (erector spinae 70-80% MVC, NSCA 2016)
- HINGE → AVAMBRACCI 0.2→0.4 (grip deadlift, Contreras 2010)

Fix balance ratios:
- Ant:Post: aggiunto GLUTEI nel denominatore (Janda 1983), target 0.80→0.65

Schema: VALID_PATTERNS esteso con 9 pattern isolation (hip_thrust, curl, etc.)
Test: 94 pass, expected values ricalcolati per nuovi coefficienti EMG.

Co-Authored-By: Claude Opus 4.6 (1M context) <noreply@anthropic.com>
</commit_message>
<xml_diff>
--- a/docs/technical/TRAINING_SCIENCE_ENGINE.docx
+++ b/docs/technical/TRAINING_SCIENCE_ENGINE.docx
@@ -5895,12 +5895,6 @@
         <w:gridCol w:w="4526"/>
       </w:tblGrid>
       <w:tr>
-        <w:tblPrEx>
-          <w:tblCellMar>
-            <w:top w:w="0" w:type="dxa"/>
-            <w:bottom w:w="0" w:type="dxa"/>
-          </w:tblCellMar>
-        </w:tblPrEx>
         <w:tc>
           <w:tcPr>
             <w:tcW w:w="2000" w:type="dxa"/>
@@ -6035,12 +6029,6 @@
         </w:tc>
       </w:tr>
       <w:tr>
-        <w:tblPrEx>
-          <w:tblCellMar>
-            <w:top w:w="0" w:type="dxa"/>
-            <w:bottom w:w="0" w:type="dxa"/>
-          </w:tblCellMar>
-        </w:tblPrEx>
         <w:tc>
           <w:tcPr>
             <w:tcW w:w="2000" w:type="dxa"/>
@@ -6156,12 +6144,6 @@
         </w:tc>
       </w:tr>
       <w:tr>
-        <w:tblPrEx>
-          <w:tblCellMar>
-            <w:top w:w="0" w:type="dxa"/>
-            <w:bottom w:w="0" w:type="dxa"/>
-          </w:tblCellMar>
-        </w:tblPrEx>
         <w:tc>
           <w:tcPr>
             <w:tcW w:w="2000" w:type="dxa"/>
@@ -6319,12 +6301,6 @@
         </w:tc>
       </w:tr>
       <w:tr>
-        <w:tblPrEx>
-          <w:tblCellMar>
-            <w:top w:w="0" w:type="dxa"/>
-            <w:bottom w:w="0" w:type="dxa"/>
-          </w:tblCellMar>
-        </w:tblPrEx>
         <w:tc>
           <w:tcPr>
             <w:tcW w:w="2000" w:type="dxa"/>
@@ -6440,12 +6416,6 @@
         </w:tc>
       </w:tr>
       <w:tr>
-        <w:tblPrEx>
-          <w:tblCellMar>
-            <w:top w:w="0" w:type="dxa"/>
-            <w:bottom w:w="0" w:type="dxa"/>
-          </w:tblCellMar>
-        </w:tblPrEx>
         <w:tc>
           <w:tcPr>
             <w:tcW w:w="2000" w:type="dxa"/>
@@ -6576,12 +6546,6 @@
         </w:tc>
       </w:tr>
       <w:tr>
-        <w:tblPrEx>
-          <w:tblCellMar>
-            <w:top w:w="0" w:type="dxa"/>
-            <w:bottom w:w="0" w:type="dxa"/>
-          </w:tblCellMar>
-        </w:tblPrEx>
         <w:tc>
           <w:tcPr>
             <w:tcW w:w="2000" w:type="dxa"/>
@@ -6697,12 +6661,6 @@
         </w:tc>
       </w:tr>
       <w:tr>
-        <w:tblPrEx>
-          <w:tblCellMar>
-            <w:top w:w="0" w:type="dxa"/>
-            <w:bottom w:w="0" w:type="dxa"/>
-          </w:tblCellMar>
-        </w:tblPrEx>
         <w:tc>
           <w:tcPr>
             <w:tcW w:w="2000" w:type="dxa"/>
@@ -7577,12 +7535,6 @@
         <w:gridCol w:w="2991"/>
       </w:tblGrid>
       <w:tr>
-        <w:tblPrEx>
-          <w:tblCellMar>
-            <w:top w:w="0" w:type="dxa"/>
-            <w:bottom w:w="0" w:type="dxa"/>
-          </w:tblCellMar>
-        </w:tblPrEx>
         <w:tc>
           <w:tcPr>
             <w:tcW w:w="1800" w:type="dxa"/>
@@ -7686,12 +7638,6 @@
         </w:tc>
       </w:tr>
       <w:tr>
-        <w:tblPrEx>
-          <w:tblCellMar>
-            <w:top w:w="0" w:type="dxa"/>
-            <w:bottom w:w="0" w:type="dxa"/>
-          </w:tblCellMar>
-        </w:tblPrEx>
         <w:tc>
           <w:tcPr>
             <w:tcW w:w="1800" w:type="dxa"/>
@@ -7772,12 +7718,6 @@
         </w:tc>
       </w:tr>
       <w:tr>
-        <w:tblPrEx>
-          <w:tblCellMar>
-            <w:top w:w="0" w:type="dxa"/>
-            <w:bottom w:w="0" w:type="dxa"/>
-          </w:tblCellMar>
-        </w:tblPrEx>
         <w:tc>
           <w:tcPr>
             <w:tcW w:w="1800" w:type="dxa"/>
@@ -7867,12 +7807,6 @@
         </w:tc>
       </w:tr>
       <w:tr>
-        <w:tblPrEx>
-          <w:tblCellMar>
-            <w:top w:w="0" w:type="dxa"/>
-            <w:bottom w:w="0" w:type="dxa"/>
-          </w:tblCellMar>
-        </w:tblPrEx>
         <w:tc>
           <w:tcPr>
             <w:tcW w:w="1800" w:type="dxa"/>
@@ -7961,12 +7895,6 @@
         </w:tc>
       </w:tr>
       <w:tr>
-        <w:tblPrEx>
-          <w:tblCellMar>
-            <w:top w:w="0" w:type="dxa"/>
-            <w:bottom w:w="0" w:type="dxa"/>
-          </w:tblCellMar>
-        </w:tblPrEx>
         <w:tc>
           <w:tcPr>
             <w:tcW w:w="1800" w:type="dxa"/>
@@ -8055,12 +7983,6 @@
         </w:tc>
       </w:tr>
       <w:tr>
-        <w:tblPrEx>
-          <w:tblCellMar>
-            <w:top w:w="0" w:type="dxa"/>
-            <w:bottom w:w="0" w:type="dxa"/>
-          </w:tblCellMar>
-        </w:tblPrEx>
         <w:tc>
           <w:tcPr>
             <w:tcW w:w="1800" w:type="dxa"/>
@@ -8143,12 +8065,6 @@
         </w:tc>
       </w:tr>
       <w:tr>
-        <w:tblPrEx>
-          <w:tblCellMar>
-            <w:top w:w="0" w:type="dxa"/>
-            <w:bottom w:w="0" w:type="dxa"/>
-          </w:tblCellMar>
-        </w:tblPrEx>
         <w:tc>
           <w:tcPr>
             <w:tcW w:w="1800" w:type="dxa"/>
@@ -8237,12 +8153,6 @@
         </w:tc>
       </w:tr>
       <w:tr>
-        <w:tblPrEx>
-          <w:tblCellMar>
-            <w:top w:w="0" w:type="dxa"/>
-            <w:bottom w:w="0" w:type="dxa"/>
-          </w:tblCellMar>
-        </w:tblPrEx>
         <w:tc>
           <w:tcPr>
             <w:tcW w:w="1800" w:type="dxa"/>
@@ -8386,12 +8296,6 @@
         <w:gridCol w:w="1573"/>
       </w:tblGrid>
       <w:tr>
-        <w:tblPrEx>
-          <w:tblCellMar>
-            <w:top w:w="0" w:type="dxa"/>
-            <w:bottom w:w="0" w:type="dxa"/>
-          </w:tblCellMar>
-        </w:tblPrEx>
         <w:tc>
           <w:tcPr>
             <w:tcW w:w="1500" w:type="dxa"/>
@@ -8647,12 +8551,6 @@
         </w:tc>
       </w:tr>
       <w:tr>
-        <w:tblPrEx>
-          <w:tblCellMar>
-            <w:top w:w="0" w:type="dxa"/>
-            <w:bottom w:w="0" w:type="dxa"/>
-          </w:tblCellMar>
-        </w:tblPrEx>
         <w:tc>
           <w:tcPr>
             <w:tcW w:w="1500" w:type="dxa"/>
@@ -8837,12 +8735,6 @@
         </w:tc>
       </w:tr>
       <w:tr>
-        <w:tblPrEx>
-          <w:tblCellMar>
-            <w:top w:w="0" w:type="dxa"/>
-            <w:bottom w:w="0" w:type="dxa"/>
-          </w:tblCellMar>
-        </w:tblPrEx>
         <w:tc>
           <w:tcPr>
             <w:tcW w:w="1500" w:type="dxa"/>
@@ -9027,12 +8919,6 @@
         </w:tc>
       </w:tr>
       <w:tr>
-        <w:tblPrEx>
-          <w:tblCellMar>
-            <w:top w:w="0" w:type="dxa"/>
-            <w:bottom w:w="0" w:type="dxa"/>
-          </w:tblCellMar>
-        </w:tblPrEx>
         <w:tc>
           <w:tcPr>
             <w:tcW w:w="1500" w:type="dxa"/>
@@ -9217,12 +9103,6 @@
         </w:tc>
       </w:tr>
       <w:tr>
-        <w:tblPrEx>
-          <w:tblCellMar>
-            <w:top w:w="0" w:type="dxa"/>
-            <w:bottom w:w="0" w:type="dxa"/>
-          </w:tblCellMar>
-        </w:tblPrEx>
         <w:tc>
           <w:tcPr>
             <w:tcW w:w="1500" w:type="dxa"/>
@@ -9407,12 +9287,6 @@
         </w:tc>
       </w:tr>
       <w:tr>
-        <w:tblPrEx>
-          <w:tblCellMar>
-            <w:top w:w="0" w:type="dxa"/>
-            <w:bottom w:w="0" w:type="dxa"/>
-          </w:tblCellMar>
-        </w:tblPrEx>
         <w:tc>
           <w:tcPr>
             <w:tcW w:w="1500" w:type="dxa"/>
@@ -9660,12 +9534,6 @@
         <w:gridCol w:w="1526"/>
       </w:tblGrid>
       <w:tr>
-        <w:tblPrEx>
-          <w:tblCellMar>
-            <w:top w:w="0" w:type="dxa"/>
-            <w:bottom w:w="0" w:type="dxa"/>
-          </w:tblCellMar>
-        </w:tblPrEx>
         <w:tc>
           <w:tcPr>
             <w:tcW w:w="1500" w:type="dxa"/>
@@ -9833,12 +9701,6 @@
         </w:tc>
       </w:tr>
       <w:tr>
-        <w:tblPrEx>
-          <w:tblCellMar>
-            <w:top w:w="0" w:type="dxa"/>
-            <w:bottom w:w="0" w:type="dxa"/>
-          </w:tblCellMar>
-        </w:tblPrEx>
         <w:tc>
           <w:tcPr>
             <w:tcW w:w="1500" w:type="dxa"/>
@@ -9971,12 +9833,6 @@
         </w:tc>
       </w:tr>
       <w:tr>
-        <w:tblPrEx>
-          <w:tblCellMar>
-            <w:top w:w="0" w:type="dxa"/>
-            <w:bottom w:w="0" w:type="dxa"/>
-          </w:tblCellMar>
-        </w:tblPrEx>
         <w:tc>
           <w:tcPr>
             <w:tcW w:w="1500" w:type="dxa"/>
@@ -10118,12 +9974,6 @@
         </w:tc>
       </w:tr>
       <w:tr>
-        <w:tblPrEx>
-          <w:tblCellMar>
-            <w:top w:w="0" w:type="dxa"/>
-            <w:bottom w:w="0" w:type="dxa"/>
-          </w:tblCellMar>
-        </w:tblPrEx>
         <w:tc>
           <w:tcPr>
             <w:tcW w:w="1500" w:type="dxa"/>
@@ -10256,12 +10106,6 @@
         </w:tc>
       </w:tr>
       <w:tr>
-        <w:tblPrEx>
-          <w:tblCellMar>
-            <w:top w:w="0" w:type="dxa"/>
-            <w:bottom w:w="0" w:type="dxa"/>
-          </w:tblCellMar>
-        </w:tblPrEx>
         <w:tc>
           <w:tcPr>
             <w:tcW w:w="1500" w:type="dxa"/>
@@ -10555,12 +10399,6 @@
         <w:gridCol w:w="528"/>
       </w:tblGrid>
       <w:tr>
-        <w:tblPrEx>
-          <w:tblCellMar>
-            <w:top w:w="0" w:type="dxa"/>
-            <w:bottom w:w="0" w:type="dxa"/>
-          </w:tblCellMar>
-        </w:tblPrEx>
         <w:tc>
           <w:tcPr>
             <w:tcW w:w="1200" w:type="dxa"/>
@@ -10996,12 +10834,6 @@
         </w:tc>
       </w:tr>
       <w:tr>
-        <w:tblPrEx>
-          <w:tblCellMar>
-            <w:top w:w="0" w:type="dxa"/>
-            <w:bottom w:w="0" w:type="dxa"/>
-          </w:tblCellMar>
-        </w:tblPrEx>
         <w:tc>
           <w:tcPr>
             <w:tcW w:w="1200" w:type="dxa"/>
@@ -11342,12 +11174,6 @@
         </w:tc>
       </w:tr>
       <w:tr>
-        <w:tblPrEx>
-          <w:tblCellMar>
-            <w:top w:w="0" w:type="dxa"/>
-            <w:bottom w:w="0" w:type="dxa"/>
-          </w:tblCellMar>
-        </w:tblPrEx>
         <w:tc>
           <w:tcPr>
             <w:tcW w:w="1200" w:type="dxa"/>
@@ -11688,12 +11514,6 @@
         </w:tc>
       </w:tr>
       <w:tr>
-        <w:tblPrEx>
-          <w:tblCellMar>
-            <w:top w:w="0" w:type="dxa"/>
-            <w:bottom w:w="0" w:type="dxa"/>
-          </w:tblCellMar>
-        </w:tblPrEx>
         <w:tc>
           <w:tcPr>
             <w:tcW w:w="1200" w:type="dxa"/>
@@ -12034,12 +11854,6 @@
         </w:tc>
       </w:tr>
       <w:tr>
-        <w:tblPrEx>
-          <w:tblCellMar>
-            <w:top w:w="0" w:type="dxa"/>
-            <w:bottom w:w="0" w:type="dxa"/>
-          </w:tblCellMar>
-        </w:tblPrEx>
         <w:tc>
           <w:tcPr>
             <w:tcW w:w="1200" w:type="dxa"/>
@@ -12380,12 +12194,6 @@
         </w:tc>
       </w:tr>
       <w:tr>
-        <w:tblPrEx>
-          <w:tblCellMar>
-            <w:top w:w="0" w:type="dxa"/>
-            <w:bottom w:w="0" w:type="dxa"/>
-          </w:tblCellMar>
-        </w:tblPrEx>
         <w:tc>
           <w:tcPr>
             <w:tcW w:w="1200" w:type="dxa"/>
@@ -12726,12 +12534,6 @@
         </w:tc>
       </w:tr>
       <w:tr>
-        <w:tblPrEx>
-          <w:tblCellMar>
-            <w:top w:w="0" w:type="dxa"/>
-            <w:bottom w:w="0" w:type="dxa"/>
-          </w:tblCellMar>
-        </w:tblPrEx>
         <w:tc>
           <w:tcPr>
             <w:tcW w:w="1200" w:type="dxa"/>
@@ -13072,12 +12874,6 @@
         </w:tc>
       </w:tr>
       <w:tr>
-        <w:tblPrEx>
-          <w:tblCellMar>
-            <w:top w:w="0" w:type="dxa"/>
-            <w:bottom w:w="0" w:type="dxa"/>
-          </w:tblCellMar>
-        </w:tblPrEx>
         <w:tc>
           <w:tcPr>
             <w:tcW w:w="1200" w:type="dxa"/>
@@ -13418,12 +13214,6 @@
         </w:tc>
       </w:tr>
       <w:tr>
-        <w:tblPrEx>
-          <w:tblCellMar>
-            <w:top w:w="0" w:type="dxa"/>
-            <w:bottom w:w="0" w:type="dxa"/>
-          </w:tblCellMar>
-        </w:tblPrEx>
         <w:tc>
           <w:tcPr>
             <w:tcW w:w="1200" w:type="dxa"/>
@@ -13764,12 +13554,6 @@
         </w:tc>
       </w:tr>
       <w:tr>
-        <w:tblPrEx>
-          <w:tblCellMar>
-            <w:top w:w="0" w:type="dxa"/>
-            <w:bottom w:w="0" w:type="dxa"/>
-          </w:tblCellMar>
-        </w:tblPrEx>
         <w:tc>
           <w:tcPr>
             <w:tcW w:w="1200" w:type="dxa"/>
@@ -14110,12 +13894,6 @@
         </w:tc>
       </w:tr>
       <w:tr>
-        <w:tblPrEx>
-          <w:tblCellMar>
-            <w:top w:w="0" w:type="dxa"/>
-            <w:bottom w:w="0" w:type="dxa"/>
-          </w:tblCellMar>
-        </w:tblPrEx>
         <w:tc>
           <w:tcPr>
             <w:tcW w:w="1200" w:type="dxa"/>
@@ -14867,12 +14645,6 @@
         <w:gridCol w:w="800"/>
       </w:tblGrid>
       <w:tr>
-        <w:tblPrEx>
-          <w:tblCellMar>
-            <w:top w:w="0" w:type="dxa"/>
-            <w:bottom w:w="0" w:type="dxa"/>
-          </w:tblCellMar>
-        </w:tblPrEx>
         <w:tc>
           <w:tcPr>
             <w:tcW w:w="1800" w:type="dxa"/>
@@ -15073,12 +14845,6 @@
         </w:tc>
       </w:tr>
       <w:tr>
-        <w:tblPrEx>
-          <w:tblCellMar>
-            <w:top w:w="0" w:type="dxa"/>
-            <w:bottom w:w="0" w:type="dxa"/>
-          </w:tblCellMar>
-        </w:tblPrEx>
         <w:tc>
           <w:tcPr>
             <w:tcW w:w="1800" w:type="dxa"/>
@@ -15237,12 +15003,6 @@
         </w:tc>
       </w:tr>
       <w:tr>
-        <w:tblPrEx>
-          <w:tblCellMar>
-            <w:top w:w="0" w:type="dxa"/>
-            <w:bottom w:w="0" w:type="dxa"/>
-          </w:tblCellMar>
-        </w:tblPrEx>
         <w:tc>
           <w:tcPr>
             <w:tcW w:w="1800" w:type="dxa"/>
@@ -15401,12 +15161,6 @@
         </w:tc>
       </w:tr>
       <w:tr>
-        <w:tblPrEx>
-          <w:tblCellMar>
-            <w:top w:w="0" w:type="dxa"/>
-            <w:bottom w:w="0" w:type="dxa"/>
-          </w:tblCellMar>
-        </w:tblPrEx>
         <w:tc>
           <w:tcPr>
             <w:tcW w:w="1800" w:type="dxa"/>
@@ -15565,12 +15319,6 @@
         </w:tc>
       </w:tr>
       <w:tr>
-        <w:tblPrEx>
-          <w:tblCellMar>
-            <w:top w:w="0" w:type="dxa"/>
-            <w:bottom w:w="0" w:type="dxa"/>
-          </w:tblCellMar>
-        </w:tblPrEx>
         <w:tc>
           <w:tcPr>
             <w:tcW w:w="1800" w:type="dxa"/>
@@ -15729,12 +15477,6 @@
         </w:tc>
       </w:tr>
       <w:tr>
-        <w:tblPrEx>
-          <w:tblCellMar>
-            <w:top w:w="0" w:type="dxa"/>
-            <w:bottom w:w="0" w:type="dxa"/>
-          </w:tblCellMar>
-        </w:tblPrEx>
         <w:tc>
           <w:tcPr>
             <w:tcW w:w="1800" w:type="dxa"/>
@@ -15893,12 +15635,6 @@
         </w:tc>
       </w:tr>
       <w:tr>
-        <w:tblPrEx>
-          <w:tblCellMar>
-            <w:top w:w="0" w:type="dxa"/>
-            <w:bottom w:w="0" w:type="dxa"/>
-          </w:tblCellMar>
-        </w:tblPrEx>
         <w:tc>
           <w:tcPr>
             <w:tcW w:w="1800" w:type="dxa"/>
@@ -16057,12 +15793,6 @@
         </w:tc>
       </w:tr>
       <w:tr>
-        <w:tblPrEx>
-          <w:tblCellMar>
-            <w:top w:w="0" w:type="dxa"/>
-            <w:bottom w:w="0" w:type="dxa"/>
-          </w:tblCellMar>
-        </w:tblPrEx>
         <w:tc>
           <w:tcPr>
             <w:tcW w:w="1800" w:type="dxa"/>
@@ -16221,12 +15951,6 @@
         </w:tc>
       </w:tr>
       <w:tr>
-        <w:tblPrEx>
-          <w:tblCellMar>
-            <w:top w:w="0" w:type="dxa"/>
-            <w:bottom w:w="0" w:type="dxa"/>
-          </w:tblCellMar>
-        </w:tblPrEx>
         <w:tc>
           <w:tcPr>
             <w:tcW w:w="1800" w:type="dxa"/>
@@ -16385,12 +16109,6 @@
         </w:tc>
       </w:tr>
       <w:tr>
-        <w:tblPrEx>
-          <w:tblCellMar>
-            <w:top w:w="0" w:type="dxa"/>
-            <w:bottom w:w="0" w:type="dxa"/>
-          </w:tblCellMar>
-        </w:tblPrEx>
         <w:tc>
           <w:tcPr>
             <w:tcW w:w="1800" w:type="dxa"/>
@@ -16549,12 +16267,6 @@
         </w:tc>
       </w:tr>
       <w:tr>
-        <w:tblPrEx>
-          <w:tblCellMar>
-            <w:top w:w="0" w:type="dxa"/>
-            <w:bottom w:w="0" w:type="dxa"/>
-          </w:tblCellMar>
-        </w:tblPrEx>
         <w:tc>
           <w:tcPr>
             <w:tcW w:w="1800" w:type="dxa"/>
@@ -16713,12 +16425,6 @@
         </w:tc>
       </w:tr>
       <w:tr>
-        <w:tblPrEx>
-          <w:tblCellMar>
-            <w:top w:w="0" w:type="dxa"/>
-            <w:bottom w:w="0" w:type="dxa"/>
-          </w:tblCellMar>
-        </w:tblPrEx>
         <w:tc>
           <w:tcPr>
             <w:tcW w:w="1800" w:type="dxa"/>
@@ -16877,12 +16583,6 @@
         </w:tc>
       </w:tr>
       <w:tr>
-        <w:tblPrEx>
-          <w:tblCellMar>
-            <w:top w:w="0" w:type="dxa"/>
-            <w:bottom w:w="0" w:type="dxa"/>
-          </w:tblCellMar>
-        </w:tblPrEx>
         <w:tc>
           <w:tcPr>
             <w:tcW w:w="1800" w:type="dxa"/>
@@ -17041,12 +16741,6 @@
         </w:tc>
       </w:tr>
       <w:tr>
-        <w:tblPrEx>
-          <w:tblCellMar>
-            <w:top w:w="0" w:type="dxa"/>
-            <w:bottom w:w="0" w:type="dxa"/>
-          </w:tblCellMar>
-        </w:tblPrEx>
         <w:tc>
           <w:tcPr>
             <w:tcW w:w="1800" w:type="dxa"/>
@@ -17205,12 +16899,6 @@
         </w:tc>
       </w:tr>
       <w:tr>
-        <w:tblPrEx>
-          <w:tblCellMar>
-            <w:top w:w="0" w:type="dxa"/>
-            <w:bottom w:w="0" w:type="dxa"/>
-          </w:tblCellMar>
-        </w:tblPrEx>
         <w:tc>
           <w:tcPr>
             <w:tcW w:w="1800" w:type="dxa"/>
@@ -17369,12 +17057,6 @@
         </w:tc>
       </w:tr>
       <w:tr>
-        <w:tblPrEx>
-          <w:tblCellMar>
-            <w:top w:w="0" w:type="dxa"/>
-            <w:bottom w:w="0" w:type="dxa"/>
-          </w:tblCellMar>
-        </w:tblPrEx>
         <w:tc>
           <w:tcPr>
             <w:tcW w:w="1800" w:type="dxa"/>
@@ -17533,12 +17215,6 @@
         </w:tc>
       </w:tr>
       <w:tr>
-        <w:tblPrEx>
-          <w:tblCellMar>
-            <w:top w:w="0" w:type="dxa"/>
-            <w:bottom w:w="0" w:type="dxa"/>
-          </w:tblCellMar>
-        </w:tblPrEx>
         <w:tc>
           <w:tcPr>
             <w:tcW w:w="1800" w:type="dxa"/>
@@ -17698,12 +17374,6 @@
         </w:tc>
       </w:tr>
       <w:tr>
-        <w:tblPrEx>
-          <w:tblCellMar>
-            <w:top w:w="0" w:type="dxa"/>
-            <w:bottom w:w="0" w:type="dxa"/>
-          </w:tblCellMar>
-        </w:tblPrEx>
         <w:tc>
           <w:tcPr>
             <w:tcW w:w="1800" w:type="dxa"/>
@@ -17862,12 +17532,6 @@
         </w:tc>
       </w:tr>
       <w:tr>
-        <w:tblPrEx>
-          <w:tblCellMar>
-            <w:top w:w="0" w:type="dxa"/>
-            <w:bottom w:w="0" w:type="dxa"/>
-          </w:tblCellMar>
-        </w:tblPrEx>
         <w:tc>
           <w:tcPr>
             <w:tcW w:w="1800" w:type="dxa"/>
@@ -18026,12 +17690,6 @@
         </w:tc>
       </w:tr>
       <w:tr>
-        <w:tblPrEx>
-          <w:tblCellMar>
-            <w:top w:w="0" w:type="dxa"/>
-            <w:bottom w:w="0" w:type="dxa"/>
-          </w:tblCellMar>
-        </w:tblPrEx>
         <w:tc>
           <w:tcPr>
             <w:tcW w:w="1800" w:type="dxa"/>
@@ -18190,12 +17848,6 @@
         </w:tc>
       </w:tr>
       <w:tr>
-        <w:tblPrEx>
-          <w:tblCellMar>
-            <w:top w:w="0" w:type="dxa"/>
-            <w:bottom w:w="0" w:type="dxa"/>
-          </w:tblCellMar>
-        </w:tblPrEx>
         <w:tc>
           <w:tcPr>
             <w:tcW w:w="1800" w:type="dxa"/>
@@ -18354,12 +18006,6 @@
         </w:tc>
       </w:tr>
       <w:tr>
-        <w:tblPrEx>
-          <w:tblCellMar>
-            <w:top w:w="0" w:type="dxa"/>
-            <w:bottom w:w="0" w:type="dxa"/>
-          </w:tblCellMar>
-        </w:tblPrEx>
         <w:tc>
           <w:tcPr>
             <w:tcW w:w="1800" w:type="dxa"/>
@@ -18518,12 +18164,6 @@
         </w:tc>
       </w:tr>
       <w:tr>
-        <w:tblPrEx>
-          <w:tblCellMar>
-            <w:top w:w="0" w:type="dxa"/>
-            <w:bottom w:w="0" w:type="dxa"/>
-          </w:tblCellMar>
-        </w:tblPrEx>
         <w:tc>
           <w:tcPr>
             <w:tcW w:w="1800" w:type="dxa"/>
@@ -18682,12 +18322,6 @@
         </w:tc>
       </w:tr>
       <w:tr>
-        <w:tblPrEx>
-          <w:tblCellMar>
-            <w:top w:w="0" w:type="dxa"/>
-            <w:bottom w:w="0" w:type="dxa"/>
-          </w:tblCellMar>
-        </w:tblPrEx>
         <w:tc>
           <w:tcPr>
             <w:tcW w:w="1800" w:type="dxa"/>
@@ -18846,12 +18480,6 @@
         </w:tc>
       </w:tr>
       <w:tr>
-        <w:tblPrEx>
-          <w:tblCellMar>
-            <w:top w:w="0" w:type="dxa"/>
-            <w:bottom w:w="0" w:type="dxa"/>
-          </w:tblCellMar>
-        </w:tblPrEx>
         <w:tc>
           <w:tcPr>
             <w:tcW w:w="1800" w:type="dxa"/>
@@ -19010,12 +18638,6 @@
         </w:tc>
       </w:tr>
       <w:tr>
-        <w:tblPrEx>
-          <w:tblCellMar>
-            <w:top w:w="0" w:type="dxa"/>
-            <w:bottom w:w="0" w:type="dxa"/>
-          </w:tblCellMar>
-        </w:tblPrEx>
         <w:tc>
           <w:tcPr>
             <w:tcW w:w="1800" w:type="dxa"/>
@@ -19174,12 +18796,6 @@
         </w:tc>
       </w:tr>
       <w:tr>
-        <w:tblPrEx>
-          <w:tblCellMar>
-            <w:top w:w="0" w:type="dxa"/>
-            <w:bottom w:w="0" w:type="dxa"/>
-          </w:tblCellMar>
-        </w:tblPrEx>
         <w:tc>
           <w:tcPr>
             <w:tcW w:w="1800" w:type="dxa"/>
@@ -19338,12 +18954,6 @@
         </w:tc>
       </w:tr>
       <w:tr>
-        <w:tblPrEx>
-          <w:tblCellMar>
-            <w:top w:w="0" w:type="dxa"/>
-            <w:bottom w:w="0" w:type="dxa"/>
-          </w:tblCellMar>
-        </w:tblPrEx>
         <w:tc>
           <w:tcPr>
             <w:tcW w:w="1800" w:type="dxa"/>
@@ -19502,12 +19112,6 @@
         </w:tc>
       </w:tr>
       <w:tr>
-        <w:tblPrEx>
-          <w:tblCellMar>
-            <w:top w:w="0" w:type="dxa"/>
-            <w:bottom w:w="0" w:type="dxa"/>
-          </w:tblCellMar>
-        </w:tblPrEx>
         <w:tc>
           <w:tcPr>
             <w:tcW w:w="1800" w:type="dxa"/>
@@ -19666,12 +19270,6 @@
         </w:tc>
       </w:tr>
       <w:tr>
-        <w:tblPrEx>
-          <w:tblCellMar>
-            <w:top w:w="0" w:type="dxa"/>
-            <w:bottom w:w="0" w:type="dxa"/>
-          </w:tblCellMar>
-        </w:tblPrEx>
         <w:tc>
           <w:tcPr>
             <w:tcW w:w="1800" w:type="dxa"/>
@@ -19830,12 +19428,6 @@
         </w:tc>
       </w:tr>
       <w:tr>
-        <w:tblPrEx>
-          <w:tblCellMar>
-            <w:top w:w="0" w:type="dxa"/>
-            <w:bottom w:w="0" w:type="dxa"/>
-          </w:tblCellMar>
-        </w:tblPrEx>
         <w:tc>
           <w:tcPr>
             <w:tcW w:w="1800" w:type="dxa"/>
@@ -19994,12 +19586,6 @@
         </w:tc>
       </w:tr>
       <w:tr>
-        <w:tblPrEx>
-          <w:tblCellMar>
-            <w:top w:w="0" w:type="dxa"/>
-            <w:bottom w:w="0" w:type="dxa"/>
-          </w:tblCellMar>
-        </w:tblPrEx>
         <w:tc>
           <w:tcPr>
             <w:tcW w:w="1800" w:type="dxa"/>
@@ -20158,12 +19744,6 @@
         </w:tc>
       </w:tr>
       <w:tr>
-        <w:tblPrEx>
-          <w:tblCellMar>
-            <w:top w:w="0" w:type="dxa"/>
-            <w:bottom w:w="0" w:type="dxa"/>
-          </w:tblCellMar>
-        </w:tblPrEx>
         <w:tc>
           <w:tcPr>
             <w:tcW w:w="1800" w:type="dxa"/>
@@ -20322,12 +19902,6 @@
         </w:tc>
       </w:tr>
       <w:tr>
-        <w:tblPrEx>
-          <w:tblCellMar>
-            <w:top w:w="0" w:type="dxa"/>
-            <w:bottom w:w="0" w:type="dxa"/>
-          </w:tblCellMar>
-        </w:tblPrEx>
         <w:tc>
           <w:tcPr>
             <w:tcW w:w="1800" w:type="dxa"/>
@@ -20486,12 +20060,6 @@
         </w:tc>
       </w:tr>
       <w:tr>
-        <w:tblPrEx>
-          <w:tblCellMar>
-            <w:top w:w="0" w:type="dxa"/>
-            <w:bottom w:w="0" w:type="dxa"/>
-          </w:tblCellMar>
-        </w:tblPrEx>
         <w:tc>
           <w:tcPr>
             <w:tcW w:w="1800" w:type="dxa"/>
@@ -20650,12 +20218,6 @@
         </w:tc>
       </w:tr>
       <w:tr>
-        <w:tblPrEx>
-          <w:tblCellMar>
-            <w:top w:w="0" w:type="dxa"/>
-            <w:bottom w:w="0" w:type="dxa"/>
-          </w:tblCellMar>
-        </w:tblPrEx>
         <w:tc>
           <w:tcPr>
             <w:tcW w:w="1800" w:type="dxa"/>
@@ -20814,12 +20376,6 @@
         </w:tc>
       </w:tr>
       <w:tr>
-        <w:tblPrEx>
-          <w:tblCellMar>
-            <w:top w:w="0" w:type="dxa"/>
-            <w:bottom w:w="0" w:type="dxa"/>
-          </w:tblCellMar>
-        </w:tblPrEx>
         <w:tc>
           <w:tcPr>
             <w:tcW w:w="1800" w:type="dxa"/>
@@ -20978,12 +20534,6 @@
         </w:tc>
       </w:tr>
       <w:tr>
-        <w:tblPrEx>
-          <w:tblCellMar>
-            <w:top w:w="0" w:type="dxa"/>
-            <w:bottom w:w="0" w:type="dxa"/>
-          </w:tblCellMar>
-        </w:tblPrEx>
         <w:tc>
           <w:tcPr>
             <w:tcW w:w="1800" w:type="dxa"/>
@@ -21142,12 +20692,6 @@
         </w:tc>
       </w:tr>
       <w:tr>
-        <w:tblPrEx>
-          <w:tblCellMar>
-            <w:top w:w="0" w:type="dxa"/>
-            <w:bottom w:w="0" w:type="dxa"/>
-          </w:tblCellMar>
-        </w:tblPrEx>
         <w:tc>
           <w:tcPr>
             <w:tcW w:w="1800" w:type="dxa"/>
@@ -21306,12 +20850,6 @@
         </w:tc>
       </w:tr>
       <w:tr>
-        <w:tblPrEx>
-          <w:tblCellMar>
-            <w:top w:w="0" w:type="dxa"/>
-            <w:bottom w:w="0" w:type="dxa"/>
-          </w:tblCellMar>
-        </w:tblPrEx>
         <w:tc>
           <w:tcPr>
             <w:tcW w:w="1800" w:type="dxa"/>
@@ -21470,12 +21008,6 @@
         </w:tc>
       </w:tr>
       <w:tr>
-        <w:tblPrEx>
-          <w:tblCellMar>
-            <w:top w:w="0" w:type="dxa"/>
-            <w:bottom w:w="0" w:type="dxa"/>
-          </w:tblCellMar>
-        </w:tblPrEx>
         <w:tc>
           <w:tcPr>
             <w:tcW w:w="1800" w:type="dxa"/>
@@ -21634,12 +21166,6 @@
         </w:tc>
       </w:tr>
       <w:tr>
-        <w:tblPrEx>
-          <w:tblCellMar>
-            <w:top w:w="0" w:type="dxa"/>
-            <w:bottom w:w="0" w:type="dxa"/>
-          </w:tblCellMar>
-        </w:tblPrEx>
         <w:tc>
           <w:tcPr>
             <w:tcW w:w="1800" w:type="dxa"/>
@@ -21798,12 +21324,6 @@
         </w:tc>
       </w:tr>
       <w:tr>
-        <w:tblPrEx>
-          <w:tblCellMar>
-            <w:top w:w="0" w:type="dxa"/>
-            <w:bottom w:w="0" w:type="dxa"/>
-          </w:tblCellMar>
-        </w:tblPrEx>
         <w:tc>
           <w:tcPr>
             <w:tcW w:w="1800" w:type="dxa"/>
@@ -21962,12 +21482,6 @@
         </w:tc>
       </w:tr>
       <w:tr>
-        <w:tblPrEx>
-          <w:tblCellMar>
-            <w:top w:w="0" w:type="dxa"/>
-            <w:bottom w:w="0" w:type="dxa"/>
-          </w:tblCellMar>
-        </w:tblPrEx>
         <w:tc>
           <w:tcPr>
             <w:tcW w:w="1800" w:type="dxa"/>
@@ -22126,12 +21640,6 @@
         </w:tc>
       </w:tr>
       <w:tr>
-        <w:tblPrEx>
-          <w:tblCellMar>
-            <w:top w:w="0" w:type="dxa"/>
-            <w:bottom w:w="0" w:type="dxa"/>
-          </w:tblCellMar>
-        </w:tblPrEx>
         <w:tc>
           <w:tcPr>
             <w:tcW w:w="1800" w:type="dxa"/>
@@ -22290,12 +21798,6 @@
         </w:tc>
       </w:tr>
       <w:tr>
-        <w:tblPrEx>
-          <w:tblCellMar>
-            <w:top w:w="0" w:type="dxa"/>
-            <w:bottom w:w="0" w:type="dxa"/>
-          </w:tblCellMar>
-        </w:tblPrEx>
         <w:tc>
           <w:tcPr>
             <w:tcW w:w="1800" w:type="dxa"/>
@@ -22844,12 +22346,6 @@
         <w:gridCol w:w="2957"/>
       </w:tblGrid>
       <w:tr>
-        <w:tblPrEx>
-          <w:tblCellMar>
-            <w:top w:w="0" w:type="dxa"/>
-            <w:bottom w:w="0" w:type="dxa"/>
-          </w:tblCellMar>
-        </w:tblPrEx>
         <w:tc>
           <w:tcPr>
             <w:tcW w:w="1800" w:type="dxa"/>
@@ -23017,12 +22513,6 @@
         </w:tc>
       </w:tr>
       <w:tr>
-        <w:tblPrEx>
-          <w:tblCellMar>
-            <w:top w:w="0" w:type="dxa"/>
-            <w:bottom w:w="0" w:type="dxa"/>
-          </w:tblCellMar>
-        </w:tblPrEx>
         <w:tc>
           <w:tcPr>
             <w:tcW w:w="1800" w:type="dxa"/>
@@ -23212,12 +22702,6 @@
         </w:tc>
       </w:tr>
       <w:tr>
-        <w:tblPrEx>
-          <w:tblCellMar>
-            <w:top w:w="0" w:type="dxa"/>
-            <w:bottom w:w="0" w:type="dxa"/>
-          </w:tblCellMar>
-        </w:tblPrEx>
         <w:tc>
           <w:tcPr>
             <w:tcW w:w="1800" w:type="dxa"/>
@@ -23416,12 +22900,6 @@
         </w:tc>
       </w:tr>
       <w:tr>
-        <w:tblPrEx>
-          <w:tblCellMar>
-            <w:top w:w="0" w:type="dxa"/>
-            <w:bottom w:w="0" w:type="dxa"/>
-          </w:tblCellMar>
-        </w:tblPrEx>
         <w:tc>
           <w:tcPr>
             <w:tcW w:w="1800" w:type="dxa"/>
@@ -23588,12 +23066,6 @@
         </w:tc>
       </w:tr>
       <w:tr>
-        <w:tblPrEx>
-          <w:tblCellMar>
-            <w:top w:w="0" w:type="dxa"/>
-            <w:bottom w:w="0" w:type="dxa"/>
-          </w:tblCellMar>
-        </w:tblPrEx>
         <w:tc>
           <w:tcPr>
             <w:tcW w:w="1800" w:type="dxa"/>
@@ -23760,12 +23232,6 @@
         </w:tc>
       </w:tr>
       <w:tr>
-        <w:tblPrEx>
-          <w:tblCellMar>
-            <w:top w:w="0" w:type="dxa"/>
-            <w:bottom w:w="0" w:type="dxa"/>
-          </w:tblCellMar>
-        </w:tblPrEx>
         <w:tc>
           <w:tcPr>
             <w:tcW w:w="1800" w:type="dxa"/>
@@ -24211,6 +23677,9 @@
       <w:pPr>
         <w:shd w:val="clear" w:color="auto" w:fill="F4F6F7"/>
         <w:ind w:left="360"/>
+        <w:rPr>
+          <w:lang w:val="en-GB"/>
+        </w:rPr>
       </w:pPr>
       <w:r>
         <w:rPr>
@@ -24226,6 +23695,7 @@
           <w:rFonts w:ascii="Consolas" w:eastAsia="Consolas" w:hAnsi="Consolas" w:cs="Consolas"/>
           <w:sz w:val="18"/>
           <w:szCs w:val="18"/>
+          <w:lang w:val="en-GB"/>
         </w:rPr>
         <w:t>ratio = n / 1.25n = 0.80</w:t>
       </w:r>
@@ -24233,10 +23703,21 @@
     <w:p>
       <w:pPr>
         <w:spacing w:after="200"/>
-      </w:pPr>
-    </w:p>
-    <w:p>
-      <w:r>
+        <w:rPr>
+          <w:lang w:val="en-GB"/>
+        </w:rPr>
+      </w:pPr>
+    </w:p>
+    <w:p>
+      <w:pPr>
+        <w:rPr>
+          <w:lang w:val="en-GB"/>
+        </w:rPr>
+      </w:pPr>
+      <w:r>
+        <w:rPr>
+          <w:lang w:val="en-GB"/>
+        </w:rPr>
         <w:br w:type="page"/>
       </w:r>
     </w:p>
@@ -24259,15 +23740,9 @@
     <w:p>
       <w:pPr>
         <w:pStyle w:val="Titolo2"/>
-        <w:rPr>
-          <w:lang w:val="en-GB"/>
-        </w:rPr>
       </w:pPr>
       <w:bookmarkStart w:id="20" w:name="_Toc227450840"/>
       <w:r>
-        <w:rPr>
-          <w:lang w:val="en-GB"/>
-        </w:rPr>
         <w:t>3.1 Split Logic (split_logic.py — 410 LOC)</w:t>
       </w:r>
       <w:bookmarkEnd w:id="20"/>
@@ -24309,12 +23784,6 @@
         <w:gridCol w:w="2426"/>
       </w:tblGrid>
       <w:tr>
-        <w:tblPrEx>
-          <w:tblCellMar>
-            <w:top w:w="0" w:type="dxa"/>
-            <w:bottom w:w="0" w:type="dxa"/>
-          </w:tblCellMar>
-        </w:tblPrEx>
         <w:tc>
           <w:tcPr>
             <w:tcW w:w="2000" w:type="dxa"/>
@@ -24449,12 +23918,6 @@
         </w:tc>
       </w:tr>
       <w:tr>
-        <w:tblPrEx>
-          <w:tblCellMar>
-            <w:top w:w="0" w:type="dxa"/>
-            <w:bottom w:w="0" w:type="dxa"/>
-          </w:tblCellMar>
-        </w:tblPrEx>
         <w:tc>
           <w:tcPr>
             <w:tcW w:w="2000" w:type="dxa"/>
@@ -24561,12 +24024,6 @@
         </w:tc>
       </w:tr>
       <w:tr>
-        <w:tblPrEx>
-          <w:tblCellMar>
-            <w:top w:w="0" w:type="dxa"/>
-            <w:bottom w:w="0" w:type="dxa"/>
-          </w:tblCellMar>
-        </w:tblPrEx>
         <w:tc>
           <w:tcPr>
             <w:tcW w:w="2000" w:type="dxa"/>
@@ -24698,12 +24155,6 @@
         </w:tc>
       </w:tr>
       <w:tr>
-        <w:tblPrEx>
-          <w:tblCellMar>
-            <w:top w:w="0" w:type="dxa"/>
-            <w:bottom w:w="0" w:type="dxa"/>
-          </w:tblCellMar>
-        </w:tblPrEx>
         <w:tc>
           <w:tcPr>
             <w:tcW w:w="2000" w:type="dxa"/>
@@ -24828,12 +24279,6 @@
         </w:tc>
       </w:tr>
       <w:tr>
-        <w:tblPrEx>
-          <w:tblCellMar>
-            <w:top w:w="0" w:type="dxa"/>
-            <w:bottom w:w="0" w:type="dxa"/>
-          </w:tblCellMar>
-        </w:tblPrEx>
         <w:tc>
           <w:tcPr>
             <w:tcW w:w="2000" w:type="dxa"/>
@@ -25397,12 +24842,6 @@
         <w:gridCol w:w="2875"/>
       </w:tblGrid>
       <w:tr>
-        <w:tblPrEx>
-          <w:tblCellMar>
-            <w:top w:w="0" w:type="dxa"/>
-            <w:bottom w:w="0" w:type="dxa"/>
-          </w:tblCellMar>
-        </w:tblPrEx>
         <w:tc>
           <w:tcPr>
             <w:tcW w:w="800" w:type="dxa"/>
@@ -25537,12 +24976,6 @@
         </w:tc>
       </w:tr>
       <w:tr>
-        <w:tblPrEx>
-          <w:tblCellMar>
-            <w:top w:w="0" w:type="dxa"/>
-            <w:bottom w:w="0" w:type="dxa"/>
-          </w:tblCellMar>
-        </w:tblPrEx>
         <w:tc>
           <w:tcPr>
             <w:tcW w:w="800" w:type="dxa"/>
@@ -25649,12 +25082,6 @@
         </w:tc>
       </w:tr>
       <w:tr>
-        <w:tblPrEx>
-          <w:tblCellMar>
-            <w:top w:w="0" w:type="dxa"/>
-            <w:bottom w:w="0" w:type="dxa"/>
-          </w:tblCellMar>
-        </w:tblPrEx>
         <w:tc>
           <w:tcPr>
             <w:tcW w:w="800" w:type="dxa"/>
@@ -25803,12 +25230,6 @@
         </w:tc>
       </w:tr>
       <w:tr>
-        <w:tblPrEx>
-          <w:tblCellMar>
-            <w:top w:w="0" w:type="dxa"/>
-            <w:bottom w:w="0" w:type="dxa"/>
-          </w:tblCellMar>
-        </w:tblPrEx>
         <w:tc>
           <w:tcPr>
             <w:tcW w:w="800" w:type="dxa"/>
@@ -25933,12 +25354,6 @@
         </w:tc>
       </w:tr>
       <w:tr>
-        <w:tblPrEx>
-          <w:tblCellMar>
-            <w:top w:w="0" w:type="dxa"/>
-            <w:bottom w:w="0" w:type="dxa"/>
-          </w:tblCellMar>
-        </w:tblPrEx>
         <w:tc>
           <w:tcPr>
             <w:tcW w:w="800" w:type="dxa"/>
@@ -26093,12 +25508,6 @@
         </w:tc>
       </w:tr>
       <w:tr>
-        <w:tblPrEx>
-          <w:tblCellMar>
-            <w:top w:w="0" w:type="dxa"/>
-            <w:bottom w:w="0" w:type="dxa"/>
-          </w:tblCellMar>
-        </w:tblPrEx>
         <w:tc>
           <w:tcPr>
             <w:tcW w:w="800" w:type="dxa"/>
@@ -26205,12 +25614,6 @@
         </w:tc>
       </w:tr>
       <w:tr>
-        <w:tblPrEx>
-          <w:tblCellMar>
-            <w:top w:w="0" w:type="dxa"/>
-            <w:bottom w:w="0" w:type="dxa"/>
-          </w:tblCellMar>
-        </w:tblPrEx>
         <w:tc>
           <w:tcPr>
             <w:tcW w:w="800" w:type="dxa"/>
@@ -26876,12 +26279,6 @@
         <w:gridCol w:w="4226"/>
       </w:tblGrid>
       <w:tr>
-        <w:tblPrEx>
-          <w:tblCellMar>
-            <w:top w:w="0" w:type="dxa"/>
-            <w:bottom w:w="0" w:type="dxa"/>
-          </w:tblCellMar>
-        </w:tblPrEx>
         <w:tc>
           <w:tcPr>
             <w:tcW w:w="1800" w:type="dxa"/>
@@ -26983,12 +26380,6 @@
         </w:tc>
       </w:tr>
       <w:tr>
-        <w:tblPrEx>
-          <w:tblCellMar>
-            <w:top w:w="0" w:type="dxa"/>
-            <w:bottom w:w="0" w:type="dxa"/>
-          </w:tblCellMar>
-        </w:tblPrEx>
         <w:tc>
           <w:tcPr>
             <w:tcW w:w="1800" w:type="dxa"/>
@@ -27071,12 +26462,6 @@
         </w:tc>
       </w:tr>
       <w:tr>
-        <w:tblPrEx>
-          <w:tblCellMar>
-            <w:top w:w="0" w:type="dxa"/>
-            <w:bottom w:w="0" w:type="dxa"/>
-          </w:tblCellMar>
-        </w:tblPrEx>
         <w:tc>
           <w:tcPr>
             <w:tcW w:w="1800" w:type="dxa"/>
@@ -27184,12 +26569,6 @@
         </w:tc>
       </w:tr>
       <w:tr>
-        <w:tblPrEx>
-          <w:tblCellMar>
-            <w:top w:w="0" w:type="dxa"/>
-            <w:bottom w:w="0" w:type="dxa"/>
-          </w:tblCellMar>
-        </w:tblPrEx>
         <w:tc>
           <w:tcPr>
             <w:tcW w:w="1800" w:type="dxa"/>
@@ -27304,12 +26683,6 @@
         </w:tc>
       </w:tr>
       <w:tr>
-        <w:tblPrEx>
-          <w:tblCellMar>
-            <w:top w:w="0" w:type="dxa"/>
-            <w:bottom w:w="0" w:type="dxa"/>
-          </w:tblCellMar>
-        </w:tblPrEx>
         <w:tc>
           <w:tcPr>
             <w:tcW w:w="1800" w:type="dxa"/>
@@ -27418,12 +26791,6 @@
         </w:tc>
       </w:tr>
       <w:tr>
-        <w:tblPrEx>
-          <w:tblCellMar>
-            <w:top w:w="0" w:type="dxa"/>
-            <w:bottom w:w="0" w:type="dxa"/>
-          </w:tblCellMar>
-        </w:tblPrEx>
         <w:tc>
           <w:tcPr>
             <w:tcW w:w="1800" w:type="dxa"/>
@@ -27993,12 +27360,6 @@
         <w:gridCol w:w="867"/>
       </w:tblGrid>
       <w:tr>
-        <w:tblPrEx>
-          <w:tblCellMar>
-            <w:top w:w="0" w:type="dxa"/>
-            <w:bottom w:w="0" w:type="dxa"/>
-          </w:tblCellMar>
-        </w:tblPrEx>
         <w:tc>
           <w:tcPr>
             <w:tcW w:w="2000" w:type="dxa"/>
@@ -28201,12 +27562,6 @@
         </w:tc>
       </w:tr>
       <w:tr>
-        <w:tblPrEx>
-          <w:tblCellMar>
-            <w:top w:w="0" w:type="dxa"/>
-            <w:bottom w:w="0" w:type="dxa"/>
-          </w:tblCellMar>
-        </w:tblPrEx>
         <w:tc>
           <w:tcPr>
             <w:tcW w:w="2000" w:type="dxa"/>
@@ -28383,12 +27738,6 @@
         </w:tc>
       </w:tr>
       <w:tr>
-        <w:tblPrEx>
-          <w:tblCellMar>
-            <w:top w:w="0" w:type="dxa"/>
-            <w:bottom w:w="0" w:type="dxa"/>
-          </w:tblCellMar>
-        </w:tblPrEx>
         <w:tc>
           <w:tcPr>
             <w:tcW w:w="2000" w:type="dxa"/>
@@ -28565,12 +27914,6 @@
         </w:tc>
       </w:tr>
       <w:tr>
-        <w:tblPrEx>
-          <w:tblCellMar>
-            <w:top w:w="0" w:type="dxa"/>
-            <w:bottom w:w="0" w:type="dxa"/>
-          </w:tblCellMar>
-        </w:tblPrEx>
         <w:tc>
           <w:tcPr>
             <w:tcW w:w="2000" w:type="dxa"/>
@@ -29159,12 +28502,6 @@
         <w:gridCol w:w="717"/>
       </w:tblGrid>
       <w:tr>
-        <w:tblPrEx>
-          <w:tblCellMar>
-            <w:top w:w="0" w:type="dxa"/>
-            <w:bottom w:w="0" w:type="dxa"/>
-          </w:tblCellMar>
-        </w:tblPrEx>
         <w:tc>
           <w:tcPr>
             <w:tcW w:w="700" w:type="dxa"/>
@@ -29596,12 +28933,6 @@
         </w:tc>
       </w:tr>
       <w:tr>
-        <w:tblPrEx>
-          <w:tblCellMar>
-            <w:top w:w="0" w:type="dxa"/>
-            <w:bottom w:w="0" w:type="dxa"/>
-          </w:tblCellMar>
-        </w:tblPrEx>
         <w:tc>
           <w:tcPr>
             <w:tcW w:w="700" w:type="dxa"/>
@@ -30131,12 +29462,6 @@
         <w:gridCol w:w="3726"/>
       </w:tblGrid>
       <w:tr>
-        <w:tblPrEx>
-          <w:tblCellMar>
-            <w:top w:w="0" w:type="dxa"/>
-            <w:bottom w:w="0" w:type="dxa"/>
-          </w:tblCellMar>
-        </w:tblPrEx>
         <w:tc>
           <w:tcPr>
             <w:tcW w:w="2000" w:type="dxa"/>
@@ -30271,12 +29596,6 @@
         </w:tc>
       </w:tr>
       <w:tr>
-        <w:tblPrEx>
-          <w:tblCellMar>
-            <w:top w:w="0" w:type="dxa"/>
-            <w:bottom w:w="0" w:type="dxa"/>
-          </w:tblCellMar>
-        </w:tblPrEx>
         <w:tc>
           <w:tcPr>
             <w:tcW w:w="2000" w:type="dxa"/>
@@ -30383,12 +29702,6 @@
         </w:tc>
       </w:tr>
       <w:tr>
-        <w:tblPrEx>
-          <w:tblCellMar>
-            <w:top w:w="0" w:type="dxa"/>
-            <w:bottom w:w="0" w:type="dxa"/>
-          </w:tblCellMar>
-        </w:tblPrEx>
         <w:tc>
           <w:tcPr>
             <w:tcW w:w="2000" w:type="dxa"/>
@@ -30495,12 +29808,6 @@
         </w:tc>
       </w:tr>
       <w:tr>
-        <w:tblPrEx>
-          <w:tblCellMar>
-            <w:top w:w="0" w:type="dxa"/>
-            <w:bottom w:w="0" w:type="dxa"/>
-          </w:tblCellMar>
-        </w:tblPrEx>
         <w:tc>
           <w:tcPr>
             <w:tcW w:w="2000" w:type="dxa"/>
@@ -30607,12 +29914,6 @@
         </w:tc>
       </w:tr>
       <w:tr>
-        <w:tblPrEx>
-          <w:tblCellMar>
-            <w:top w:w="0" w:type="dxa"/>
-            <w:bottom w:w="0" w:type="dxa"/>
-          </w:tblCellMar>
-        </w:tblPrEx>
         <w:tc>
           <w:tcPr>
             <w:tcW w:w="2000" w:type="dxa"/>
@@ -30719,12 +30020,6 @@
         </w:tc>
       </w:tr>
       <w:tr>
-        <w:tblPrEx>
-          <w:tblCellMar>
-            <w:top w:w="0" w:type="dxa"/>
-            <w:bottom w:w="0" w:type="dxa"/>
-          </w:tblCellMar>
-        </w:tblPrEx>
         <w:tc>
           <w:tcPr>
             <w:tcW w:w="2000" w:type="dxa"/>
@@ -31427,12 +30722,6 @@
         <w:gridCol w:w="1918"/>
       </w:tblGrid>
       <w:tr>
-        <w:tblPrEx>
-          <w:tblCellMar>
-            <w:top w:w="0" w:type="dxa"/>
-            <w:bottom w:w="0" w:type="dxa"/>
-          </w:tblCellMar>
-        </w:tblPrEx>
         <w:tc>
           <w:tcPr>
             <w:tcW w:w="400" w:type="dxa"/>
@@ -31633,12 +30922,6 @@
         </w:tc>
       </w:tr>
       <w:tr>
-        <w:tblPrEx>
-          <w:tblCellMar>
-            <w:top w:w="0" w:type="dxa"/>
-            <w:bottom w:w="0" w:type="dxa"/>
-          </w:tblCellMar>
-        </w:tblPrEx>
         <w:tc>
           <w:tcPr>
             <w:tcW w:w="400" w:type="dxa"/>
@@ -31806,12 +31089,6 @@
         </w:tc>
       </w:tr>
       <w:tr>
-        <w:tblPrEx>
-          <w:tblCellMar>
-            <w:top w:w="0" w:type="dxa"/>
-            <w:bottom w:w="0" w:type="dxa"/>
-          </w:tblCellMar>
-        </w:tblPrEx>
         <w:tc>
           <w:tcPr>
             <w:tcW w:w="400" w:type="dxa"/>
@@ -31972,12 +31249,6 @@
         </w:tc>
       </w:tr>
       <w:tr>
-        <w:tblPrEx>
-          <w:tblCellMar>
-            <w:top w:w="0" w:type="dxa"/>
-            <w:bottom w:w="0" w:type="dxa"/>
-          </w:tblCellMar>
-        </w:tblPrEx>
         <w:tc>
           <w:tcPr>
             <w:tcW w:w="400" w:type="dxa"/>
@@ -32147,12 +31418,6 @@
         </w:tc>
       </w:tr>
       <w:tr>
-        <w:tblPrEx>
-          <w:tblCellMar>
-            <w:top w:w="0" w:type="dxa"/>
-            <w:bottom w:w="0" w:type="dxa"/>
-          </w:tblCellMar>
-        </w:tblPrEx>
         <w:tc>
           <w:tcPr>
             <w:tcW w:w="400" w:type="dxa"/>
@@ -32365,12 +31630,6 @@
         </w:tc>
       </w:tr>
       <w:tr>
-        <w:tblPrEx>
-          <w:tblCellMar>
-            <w:top w:w="0" w:type="dxa"/>
-            <w:bottom w:w="0" w:type="dxa"/>
-          </w:tblCellMar>
-        </w:tblPrEx>
         <w:tc>
           <w:tcPr>
             <w:tcW w:w="400" w:type="dxa"/>
@@ -32531,12 +31790,6 @@
         </w:tc>
       </w:tr>
       <w:tr>
-        <w:tblPrEx>
-          <w:tblCellMar>
-            <w:top w:w="0" w:type="dxa"/>
-            <w:bottom w:w="0" w:type="dxa"/>
-          </w:tblCellMar>
-        </w:tblPrEx>
         <w:tc>
           <w:tcPr>
             <w:tcW w:w="400" w:type="dxa"/>
@@ -32704,12 +31957,6 @@
         </w:tc>
       </w:tr>
       <w:tr>
-        <w:tblPrEx>
-          <w:tblCellMar>
-            <w:top w:w="0" w:type="dxa"/>
-            <w:bottom w:w="0" w:type="dxa"/>
-          </w:tblCellMar>
-        </w:tblPrEx>
         <w:tc>
           <w:tcPr>
             <w:tcW w:w="400" w:type="dxa"/>
@@ -32895,12 +32142,6 @@
         </w:tc>
       </w:tr>
       <w:tr>
-        <w:tblPrEx>
-          <w:tblCellMar>
-            <w:top w:w="0" w:type="dxa"/>
-            <w:bottom w:w="0" w:type="dxa"/>
-          </w:tblCellMar>
-        </w:tblPrEx>
         <w:tc>
           <w:tcPr>
             <w:tcW w:w="400" w:type="dxa"/>
@@ -33086,12 +32327,6 @@
         </w:tc>
       </w:tr>
       <w:tr>
-        <w:tblPrEx>
-          <w:tblCellMar>
-            <w:top w:w="0" w:type="dxa"/>
-            <w:bottom w:w="0" w:type="dxa"/>
-          </w:tblCellMar>
-        </w:tblPrEx>
         <w:tc>
           <w:tcPr>
             <w:tcW w:w="400" w:type="dxa"/>
@@ -33259,12 +32494,6 @@
         </w:tc>
       </w:tr>
       <w:tr>
-        <w:tblPrEx>
-          <w:tblCellMar>
-            <w:top w:w="0" w:type="dxa"/>
-            <w:bottom w:w="0" w:type="dxa"/>
-          </w:tblCellMar>
-        </w:tblPrEx>
         <w:tc>
           <w:tcPr>
             <w:tcW w:w="400" w:type="dxa"/>
@@ -33903,12 +33132,6 @@
         <w:gridCol w:w="5626"/>
       </w:tblGrid>
       <w:tr>
-        <w:tblPrEx>
-          <w:tblCellMar>
-            <w:top w:w="0" w:type="dxa"/>
-            <w:bottom w:w="0" w:type="dxa"/>
-          </w:tblCellMar>
-        </w:tblPrEx>
         <w:tc>
           <w:tcPr>
             <w:tcW w:w="2000" w:type="dxa"/>
@@ -34010,12 +33233,6 @@
         </w:tc>
       </w:tr>
       <w:tr>
-        <w:tblPrEx>
-          <w:tblCellMar>
-            <w:top w:w="0" w:type="dxa"/>
-            <w:bottom w:w="0" w:type="dxa"/>
-          </w:tblCellMar>
-        </w:tblPrEx>
         <w:tc>
           <w:tcPr>
             <w:tcW w:w="2000" w:type="dxa"/>
@@ -34105,12 +33322,6 @@
         </w:tc>
       </w:tr>
       <w:tr>
-        <w:tblPrEx>
-          <w:tblCellMar>
-            <w:top w:w="0" w:type="dxa"/>
-            <w:bottom w:w="0" w:type="dxa"/>
-          </w:tblCellMar>
-        </w:tblPrEx>
         <w:tc>
           <w:tcPr>
             <w:tcW w:w="2000" w:type="dxa"/>
@@ -34191,12 +33402,6 @@
         </w:tc>
       </w:tr>
       <w:tr>
-        <w:tblPrEx>
-          <w:tblCellMar>
-            <w:top w:w="0" w:type="dxa"/>
-            <w:bottom w:w="0" w:type="dxa"/>
-          </w:tblCellMar>
-        </w:tblPrEx>
         <w:tc>
           <w:tcPr>
             <w:tcW w:w="2000" w:type="dxa"/>
@@ -34279,12 +33484,6 @@
         </w:tc>
       </w:tr>
       <w:tr>
-        <w:tblPrEx>
-          <w:tblCellMar>
-            <w:top w:w="0" w:type="dxa"/>
-            <w:bottom w:w="0" w:type="dxa"/>
-          </w:tblCellMar>
-        </w:tblPrEx>
         <w:tc>
           <w:tcPr>
             <w:tcW w:w="2000" w:type="dxa"/>
@@ -34383,12 +33582,6 @@
         </w:tc>
       </w:tr>
       <w:tr>
-        <w:tblPrEx>
-          <w:tblCellMar>
-            <w:top w:w="0" w:type="dxa"/>
-            <w:bottom w:w="0" w:type="dxa"/>
-          </w:tblCellMar>
-        </w:tblPrEx>
         <w:tc>
           <w:tcPr>
             <w:tcW w:w="2000" w:type="dxa"/>
@@ -34528,12 +33721,6 @@
         </w:tc>
       </w:tr>
       <w:tr>
-        <w:tblPrEx>
-          <w:tblCellMar>
-            <w:top w:w="0" w:type="dxa"/>
-            <w:bottom w:w="0" w:type="dxa"/>
-          </w:tblCellMar>
-        </w:tblPrEx>
         <w:tc>
           <w:tcPr>
             <w:tcW w:w="2000" w:type="dxa"/>
@@ -34646,12 +33833,6 @@
         </w:tc>
       </w:tr>
       <w:tr>
-        <w:tblPrEx>
-          <w:tblCellMar>
-            <w:top w:w="0" w:type="dxa"/>
-            <w:bottom w:w="0" w:type="dxa"/>
-          </w:tblCellMar>
-        </w:tblPrEx>
         <w:tc>
           <w:tcPr>
             <w:tcW w:w="2000" w:type="dxa"/>
@@ -34767,12 +33948,6 @@
         </w:tc>
       </w:tr>
       <w:tr>
-        <w:tblPrEx>
-          <w:tblCellMar>
-            <w:top w:w="0" w:type="dxa"/>
-            <w:bottom w:w="0" w:type="dxa"/>
-          </w:tblCellMar>
-        </w:tblPrEx>
         <w:tc>
           <w:tcPr>
             <w:tcW w:w="2000" w:type="dxa"/>
@@ -34869,12 +34044,6 @@
         </w:tc>
       </w:tr>
       <w:tr>
-        <w:tblPrEx>
-          <w:tblCellMar>
-            <w:top w:w="0" w:type="dxa"/>
-            <w:bottom w:w="0" w:type="dxa"/>
-          </w:tblCellMar>
-        </w:tblPrEx>
         <w:tc>
           <w:tcPr>
             <w:tcW w:w="2000" w:type="dxa"/>
@@ -36750,12 +35919,6 @@
         <w:gridCol w:w="2026"/>
       </w:tblGrid>
       <w:tr>
-        <w:tblPrEx>
-          <w:tblCellMar>
-            <w:top w:w="0" w:type="dxa"/>
-            <w:bottom w:w="0" w:type="dxa"/>
-          </w:tblCellMar>
-        </w:tblPrEx>
         <w:tc>
           <w:tcPr>
             <w:tcW w:w="1000" w:type="dxa"/>
@@ -36890,12 +36053,6 @@
         </w:tc>
       </w:tr>
       <w:tr>
-        <w:tblPrEx>
-          <w:tblCellMar>
-            <w:top w:w="0" w:type="dxa"/>
-            <w:bottom w:w="0" w:type="dxa"/>
-          </w:tblCellMar>
-        </w:tblPrEx>
         <w:tc>
           <w:tcPr>
             <w:tcW w:w="1000" w:type="dxa"/>
@@ -37018,12 +36175,6 @@
         </w:tc>
       </w:tr>
       <w:tr>
-        <w:tblPrEx>
-          <w:tblCellMar>
-            <w:top w:w="0" w:type="dxa"/>
-            <w:bottom w:w="0" w:type="dxa"/>
-          </w:tblCellMar>
-        </w:tblPrEx>
         <w:tc>
           <w:tcPr>
             <w:tcW w:w="1000" w:type="dxa"/>
@@ -37130,12 +36281,6 @@
         </w:tc>
       </w:tr>
       <w:tr>
-        <w:tblPrEx>
-          <w:tblCellMar>
-            <w:top w:w="0" w:type="dxa"/>
-            <w:bottom w:w="0" w:type="dxa"/>
-          </w:tblCellMar>
-        </w:tblPrEx>
         <w:tc>
           <w:tcPr>
             <w:tcW w:w="1000" w:type="dxa"/>
@@ -37242,12 +36387,6 @@
         </w:tc>
       </w:tr>
       <w:tr>
-        <w:tblPrEx>
-          <w:tblCellMar>
-            <w:top w:w="0" w:type="dxa"/>
-            <w:bottom w:w="0" w:type="dxa"/>
-          </w:tblCellMar>
-        </w:tblPrEx>
         <w:tc>
           <w:tcPr>
             <w:tcW w:w="1000" w:type="dxa"/>
@@ -37354,12 +36493,6 @@
         </w:tc>
       </w:tr>
       <w:tr>
-        <w:tblPrEx>
-          <w:tblCellMar>
-            <w:top w:w="0" w:type="dxa"/>
-            <w:bottom w:w="0" w:type="dxa"/>
-          </w:tblCellMar>
-        </w:tblPrEx>
         <w:tc>
           <w:tcPr>
             <w:tcW w:w="1000" w:type="dxa"/>
@@ -37466,12 +36599,6 @@
         </w:tc>
       </w:tr>
       <w:tr>
-        <w:tblPrEx>
-          <w:tblCellMar>
-            <w:top w:w="0" w:type="dxa"/>
-            <w:bottom w:w="0" w:type="dxa"/>
-          </w:tblCellMar>
-        </w:tblPrEx>
         <w:tc>
           <w:tcPr>
             <w:tcW w:w="1000" w:type="dxa"/>
@@ -37628,12 +36755,6 @@
         </w:tc>
       </w:tr>
       <w:tr>
-        <w:tblPrEx>
-          <w:tblCellMar>
-            <w:top w:w="0" w:type="dxa"/>
-            <w:bottom w:w="0" w:type="dxa"/>
-          </w:tblCellMar>
-        </w:tblPrEx>
         <w:tc>
           <w:tcPr>
             <w:tcW w:w="1000" w:type="dxa"/>
@@ -37740,12 +36861,6 @@
         </w:tc>
       </w:tr>
       <w:tr>
-        <w:tblPrEx>
-          <w:tblCellMar>
-            <w:top w:w="0" w:type="dxa"/>
-            <w:bottom w:w="0" w:type="dxa"/>
-          </w:tblCellMar>
-        </w:tblPrEx>
         <w:tc>
           <w:tcPr>
             <w:tcW w:w="1000" w:type="dxa"/>
@@ -37868,12 +36983,6 @@
         </w:tc>
       </w:tr>
       <w:tr>
-        <w:tblPrEx>
-          <w:tblCellMar>
-            <w:top w:w="0" w:type="dxa"/>
-            <w:bottom w:w="0" w:type="dxa"/>
-          </w:tblCellMar>
-        </w:tblPrEx>
         <w:tc>
           <w:tcPr>
             <w:tcW w:w="1000" w:type="dxa"/>
@@ -37980,12 +37089,6 @@
         </w:tc>
       </w:tr>
       <w:tr>
-        <w:tblPrEx>
-          <w:tblCellMar>
-            <w:top w:w="0" w:type="dxa"/>
-            <w:bottom w:w="0" w:type="dxa"/>
-          </w:tblCellMar>
-        </w:tblPrEx>
         <w:tc>
           <w:tcPr>
             <w:tcW w:w="1000" w:type="dxa"/>
@@ -38092,12 +37195,6 @@
         </w:tc>
       </w:tr>
       <w:tr>
-        <w:tblPrEx>
-          <w:tblCellMar>
-            <w:top w:w="0" w:type="dxa"/>
-            <w:bottom w:w="0" w:type="dxa"/>
-          </w:tblCellMar>
-        </w:tblPrEx>
         <w:tc>
           <w:tcPr>
             <w:tcW w:w="1000" w:type="dxa"/>
@@ -38204,12 +37301,6 @@
         </w:tc>
       </w:tr>
       <w:tr>
-        <w:tblPrEx>
-          <w:tblCellMar>
-            <w:top w:w="0" w:type="dxa"/>
-            <w:bottom w:w="0" w:type="dxa"/>
-          </w:tblCellMar>
-        </w:tblPrEx>
         <w:tc>
           <w:tcPr>
             <w:tcW w:w="1000" w:type="dxa"/>
@@ -38316,12 +37407,6 @@
         </w:tc>
       </w:tr>
       <w:tr>
-        <w:tblPrEx>
-          <w:tblCellMar>
-            <w:top w:w="0" w:type="dxa"/>
-            <w:bottom w:w="0" w:type="dxa"/>
-          </w:tblCellMar>
-        </w:tblPrEx>
         <w:tc>
           <w:tcPr>
             <w:tcW w:w="1000" w:type="dxa"/>
@@ -38553,12 +37638,6 @@
         <w:gridCol w:w="2326"/>
       </w:tblGrid>
       <w:tr>
-        <w:tblPrEx>
-          <w:tblCellMar>
-            <w:top w:w="0" w:type="dxa"/>
-            <w:bottom w:w="0" w:type="dxa"/>
-          </w:tblCellMar>
-        </w:tblPrEx>
         <w:tc>
           <w:tcPr>
             <w:tcW w:w="1200" w:type="dxa"/>
@@ -38693,12 +37772,6 @@
         </w:tc>
       </w:tr>
       <w:tr>
-        <w:tblPrEx>
-          <w:tblCellMar>
-            <w:top w:w="0" w:type="dxa"/>
-            <w:bottom w:w="0" w:type="dxa"/>
-          </w:tblCellMar>
-        </w:tblPrEx>
         <w:tc>
           <w:tcPr>
             <w:tcW w:w="1200" w:type="dxa"/>
@@ -38816,12 +37889,6 @@
         </w:tc>
       </w:tr>
       <w:tr>
-        <w:tblPrEx>
-          <w:tblCellMar>
-            <w:top w:w="0" w:type="dxa"/>
-            <w:bottom w:w="0" w:type="dxa"/>
-          </w:tblCellMar>
-        </w:tblPrEx>
         <w:tc>
           <w:tcPr>
             <w:tcW w:w="1200" w:type="dxa"/>
@@ -38939,12 +38006,6 @@
         </w:tc>
       </w:tr>
       <w:tr>
-        <w:tblPrEx>
-          <w:tblCellMar>
-            <w:top w:w="0" w:type="dxa"/>
-            <w:bottom w:w="0" w:type="dxa"/>
-          </w:tblCellMar>
-        </w:tblPrEx>
         <w:tc>
           <w:tcPr>
             <w:tcW w:w="1200" w:type="dxa"/>
@@ -39144,12 +38205,6 @@
         <w:gridCol w:w="5026"/>
       </w:tblGrid>
       <w:tr>
-        <w:tblPrEx>
-          <w:tblCellMar>
-            <w:top w:w="0" w:type="dxa"/>
-            <w:bottom w:w="0" w:type="dxa"/>
-          </w:tblCellMar>
-        </w:tblPrEx>
         <w:tc>
           <w:tcPr>
             <w:tcW w:w="2000" w:type="dxa"/>
@@ -39251,12 +38306,6 @@
         </w:tc>
       </w:tr>
       <w:tr>
-        <w:tblPrEx>
-          <w:tblCellMar>
-            <w:top w:w="0" w:type="dxa"/>
-            <w:bottom w:w="0" w:type="dxa"/>
-          </w:tblCellMar>
-        </w:tblPrEx>
         <w:tc>
           <w:tcPr>
             <w:tcW w:w="2000" w:type="dxa"/>
@@ -39339,12 +38388,6 @@
         </w:tc>
       </w:tr>
       <w:tr>
-        <w:tblPrEx>
-          <w:tblCellMar>
-            <w:top w:w="0" w:type="dxa"/>
-            <w:bottom w:w="0" w:type="dxa"/>
-          </w:tblCellMar>
-        </w:tblPrEx>
         <w:tc>
           <w:tcPr>
             <w:tcW w:w="2000" w:type="dxa"/>
@@ -39427,12 +38470,6 @@
         </w:tc>
       </w:tr>
       <w:tr>
-        <w:tblPrEx>
-          <w:tblCellMar>
-            <w:top w:w="0" w:type="dxa"/>
-            <w:bottom w:w="0" w:type="dxa"/>
-          </w:tblCellMar>
-        </w:tblPrEx>
         <w:tc>
           <w:tcPr>
             <w:tcW w:w="2000" w:type="dxa"/>
@@ -39515,12 +38552,6 @@
         </w:tc>
       </w:tr>
       <w:tr>
-        <w:tblPrEx>
-          <w:tblCellMar>
-            <w:top w:w="0" w:type="dxa"/>
-            <w:bottom w:w="0" w:type="dxa"/>
-          </w:tblCellMar>
-        </w:tblPrEx>
         <w:tc>
           <w:tcPr>
             <w:tcW w:w="2000" w:type="dxa"/>
@@ -39603,12 +38634,6 @@
         </w:tc>
       </w:tr>
       <w:tr>
-        <w:tblPrEx>
-          <w:tblCellMar>
-            <w:top w:w="0" w:type="dxa"/>
-            <w:bottom w:w="0" w:type="dxa"/>
-          </w:tblCellMar>
-        </w:tblPrEx>
         <w:tc>
           <w:tcPr>
             <w:tcW w:w="2000" w:type="dxa"/>
@@ -40436,12 +39461,6 @@
         <w:gridCol w:w="3826"/>
       </w:tblGrid>
       <w:tr>
-        <w:tblPrEx>
-          <w:tblCellMar>
-            <w:top w:w="0" w:type="dxa"/>
-            <w:bottom w:w="0" w:type="dxa"/>
-          </w:tblCellMar>
-        </w:tblPrEx>
         <w:tc>
           <w:tcPr>
             <w:tcW w:w="1500" w:type="dxa"/>
@@ -40576,12 +39595,6 @@
         </w:tc>
       </w:tr>
       <w:tr>
-        <w:tblPrEx>
-          <w:tblCellMar>
-            <w:top w:w="0" w:type="dxa"/>
-            <w:bottom w:w="0" w:type="dxa"/>
-          </w:tblCellMar>
-        </w:tblPrEx>
         <w:tc>
           <w:tcPr>
             <w:tcW w:w="1500" w:type="dxa"/>
@@ -40690,12 +39703,6 @@
         </w:tc>
       </w:tr>
       <w:tr>
-        <w:tblPrEx>
-          <w:tblCellMar>
-            <w:top w:w="0" w:type="dxa"/>
-            <w:bottom w:w="0" w:type="dxa"/>
-          </w:tblCellMar>
-        </w:tblPrEx>
         <w:tc>
           <w:tcPr>
             <w:tcW w:w="1500" w:type="dxa"/>
@@ -40804,12 +39811,6 @@
         </w:tc>
       </w:tr>
       <w:tr>
-        <w:tblPrEx>
-          <w:tblCellMar>
-            <w:top w:w="0" w:type="dxa"/>
-            <w:bottom w:w="0" w:type="dxa"/>
-          </w:tblCellMar>
-        </w:tblPrEx>
         <w:tc>
           <w:tcPr>
             <w:tcW w:w="1500" w:type="dxa"/>
@@ -40916,12 +39917,6 @@
         </w:tc>
       </w:tr>
       <w:tr>
-        <w:tblPrEx>
-          <w:tblCellMar>
-            <w:top w:w="0" w:type="dxa"/>
-            <w:bottom w:w="0" w:type="dxa"/>
-          </w:tblCellMar>
-        </w:tblPrEx>
         <w:tc>
           <w:tcPr>
             <w:tcW w:w="1500" w:type="dxa"/>
@@ -41592,12 +40587,6 @@
         <w:gridCol w:w="5526"/>
       </w:tblGrid>
       <w:tr>
-        <w:tblPrEx>
-          <w:tblCellMar>
-            <w:top w:w="0" w:type="dxa"/>
-            <w:bottom w:w="0" w:type="dxa"/>
-          </w:tblCellMar>
-        </w:tblPrEx>
         <w:tc>
           <w:tcPr>
             <w:tcW w:w="2500" w:type="dxa"/>
@@ -41699,12 +40688,6 @@
         </w:tc>
       </w:tr>
       <w:tr>
-        <w:tblPrEx>
-          <w:tblCellMar>
-            <w:top w:w="0" w:type="dxa"/>
-            <w:bottom w:w="0" w:type="dxa"/>
-          </w:tblCellMar>
-        </w:tblPrEx>
         <w:tc>
           <w:tcPr>
             <w:tcW w:w="2500" w:type="dxa"/>
@@ -41819,12 +40802,6 @@
         </w:tc>
       </w:tr>
       <w:tr>
-        <w:tblPrEx>
-          <w:tblCellMar>
-            <w:top w:w="0" w:type="dxa"/>
-            <w:bottom w:w="0" w:type="dxa"/>
-          </w:tblCellMar>
-        </w:tblPrEx>
         <w:tc>
           <w:tcPr>
             <w:tcW w:w="2500" w:type="dxa"/>
@@ -41907,12 +40884,6 @@
         </w:tc>
       </w:tr>
       <w:tr>
-        <w:tblPrEx>
-          <w:tblCellMar>
-            <w:top w:w="0" w:type="dxa"/>
-            <w:bottom w:w="0" w:type="dxa"/>
-          </w:tblCellMar>
-        </w:tblPrEx>
         <w:tc>
           <w:tcPr>
             <w:tcW w:w="2500" w:type="dxa"/>
@@ -41995,12 +40966,6 @@
         </w:tc>
       </w:tr>
       <w:tr>
-        <w:tblPrEx>
-          <w:tblCellMar>
-            <w:top w:w="0" w:type="dxa"/>
-            <w:bottom w:w="0" w:type="dxa"/>
-          </w:tblCellMar>
-        </w:tblPrEx>
         <w:tc>
           <w:tcPr>
             <w:tcW w:w="2500" w:type="dxa"/>
@@ -42081,12 +41046,6 @@
         </w:tc>
       </w:tr>
       <w:tr>
-        <w:tblPrEx>
-          <w:tblCellMar>
-            <w:top w:w="0" w:type="dxa"/>
-            <w:bottom w:w="0" w:type="dxa"/>
-          </w:tblCellMar>
-        </w:tblPrEx>
         <w:tc>
           <w:tcPr>
             <w:tcW w:w="2500" w:type="dxa"/>
@@ -42194,12 +41153,6 @@
         </w:tc>
       </w:tr>
       <w:tr>
-        <w:tblPrEx>
-          <w:tblCellMar>
-            <w:top w:w="0" w:type="dxa"/>
-            <w:bottom w:w="0" w:type="dxa"/>
-          </w:tblCellMar>
-        </w:tblPrEx>
         <w:tc>
           <w:tcPr>
             <w:tcW w:w="2500" w:type="dxa"/>
@@ -42280,12 +41233,6 @@
         </w:tc>
       </w:tr>
       <w:tr>
-        <w:tblPrEx>
-          <w:tblCellMar>
-            <w:top w:w="0" w:type="dxa"/>
-            <w:bottom w:w="0" w:type="dxa"/>
-          </w:tblCellMar>
-        </w:tblPrEx>
         <w:tc>
           <w:tcPr>
             <w:tcW w:w="2500" w:type="dxa"/>
@@ -42393,12 +41340,6 @@
         </w:tc>
       </w:tr>
       <w:tr>
-        <w:tblPrEx>
-          <w:tblCellMar>
-            <w:top w:w="0" w:type="dxa"/>
-            <w:bottom w:w="0" w:type="dxa"/>
-          </w:tblCellMar>
-        </w:tblPrEx>
         <w:tc>
           <w:tcPr>
             <w:tcW w:w="2500" w:type="dxa"/>
@@ -42490,12 +41431,6 @@
         </w:tc>
       </w:tr>
       <w:tr>
-        <w:tblPrEx>
-          <w:tblCellMar>
-            <w:top w:w="0" w:type="dxa"/>
-            <w:bottom w:w="0" w:type="dxa"/>
-          </w:tblCellMar>
-        </w:tblPrEx>
         <w:tc>
           <w:tcPr>
             <w:tcW w:w="2500" w:type="dxa"/>
@@ -42603,12 +41538,6 @@
         </w:tc>
       </w:tr>
       <w:tr>
-        <w:tblPrEx>
-          <w:tblCellMar>
-            <w:top w:w="0" w:type="dxa"/>
-            <w:bottom w:w="0" w:type="dxa"/>
-          </w:tblCellMar>
-        </w:tblPrEx>
         <w:tc>
           <w:tcPr>
             <w:tcW w:w="2500" w:type="dxa"/>
@@ -43103,12 +42032,6 @@
         <w:gridCol w:w="4409"/>
       </w:tblGrid>
       <w:tr>
-        <w:tblPrEx>
-          <w:tblCellMar>
-            <w:top w:w="0" w:type="dxa"/>
-            <w:bottom w:w="0" w:type="dxa"/>
-          </w:tblCellMar>
-        </w:tblPrEx>
         <w:tc>
           <w:tcPr>
             <w:tcW w:w="400" w:type="dxa"/>
@@ -43243,12 +42166,6 @@
         </w:tc>
       </w:tr>
       <w:tr>
-        <w:tblPrEx>
-          <w:tblCellMar>
-            <w:top w:w="0" w:type="dxa"/>
-            <w:bottom w:w="0" w:type="dxa"/>
-          </w:tblCellMar>
-        </w:tblPrEx>
         <w:tc>
           <w:tcPr>
             <w:tcW w:w="400" w:type="dxa"/>
@@ -43370,12 +42287,6 @@
         </w:tc>
       </w:tr>
       <w:tr>
-        <w:tblPrEx>
-          <w:tblCellMar>
-            <w:top w:w="0" w:type="dxa"/>
-            <w:bottom w:w="0" w:type="dxa"/>
-          </w:tblCellMar>
-        </w:tblPrEx>
         <w:tc>
           <w:tcPr>
             <w:tcW w:w="400" w:type="dxa"/>
@@ -43523,12 +42434,6 @@
         </w:tc>
       </w:tr>
       <w:tr>
-        <w:tblPrEx>
-          <w:tblCellMar>
-            <w:top w:w="0" w:type="dxa"/>
-            <w:bottom w:w="0" w:type="dxa"/>
-          </w:tblCellMar>
-        </w:tblPrEx>
         <w:tc>
           <w:tcPr>
             <w:tcW w:w="400" w:type="dxa"/>
@@ -43641,12 +42546,6 @@
         </w:tc>
       </w:tr>
       <w:tr>
-        <w:tblPrEx>
-          <w:tblCellMar>
-            <w:top w:w="0" w:type="dxa"/>
-            <w:bottom w:w="0" w:type="dxa"/>
-          </w:tblCellMar>
-        </w:tblPrEx>
         <w:tc>
           <w:tcPr>
             <w:tcW w:w="400" w:type="dxa"/>
@@ -43807,12 +42706,6 @@
         </w:tc>
       </w:tr>
       <w:tr>
-        <w:tblPrEx>
-          <w:tblCellMar>
-            <w:top w:w="0" w:type="dxa"/>
-            <w:bottom w:w="0" w:type="dxa"/>
-          </w:tblCellMar>
-        </w:tblPrEx>
         <w:tc>
           <w:tcPr>
             <w:tcW w:w="400" w:type="dxa"/>
@@ -43944,12 +42837,6 @@
         </w:tc>
       </w:tr>
       <w:tr>
-        <w:tblPrEx>
-          <w:tblCellMar>
-            <w:top w:w="0" w:type="dxa"/>
-            <w:bottom w:w="0" w:type="dxa"/>
-          </w:tblCellMar>
-        </w:tblPrEx>
         <w:tc>
           <w:tcPr>
             <w:tcW w:w="400" w:type="dxa"/>
@@ -44087,12 +42974,6 @@
         </w:tc>
       </w:tr>
       <w:tr>
-        <w:tblPrEx>
-          <w:tblCellMar>
-            <w:top w:w="0" w:type="dxa"/>
-            <w:bottom w:w="0" w:type="dxa"/>
-          </w:tblCellMar>
-        </w:tblPrEx>
         <w:tc>
           <w:tcPr>
             <w:tcW w:w="400" w:type="dxa"/>
@@ -44205,12 +43086,6 @@
         </w:tc>
       </w:tr>
       <w:tr>
-        <w:tblPrEx>
-          <w:tblCellMar>
-            <w:top w:w="0" w:type="dxa"/>
-            <w:bottom w:w="0" w:type="dxa"/>
-          </w:tblCellMar>
-        </w:tblPrEx>
         <w:tc>
           <w:tcPr>
             <w:tcW w:w="400" w:type="dxa"/>
@@ -44333,12 +43208,6 @@
         </w:tc>
       </w:tr>
       <w:tr>
-        <w:tblPrEx>
-          <w:tblCellMar>
-            <w:top w:w="0" w:type="dxa"/>
-            <w:bottom w:w="0" w:type="dxa"/>
-          </w:tblCellMar>
-        </w:tblPrEx>
         <w:tc>
           <w:tcPr>
             <w:tcW w:w="400" w:type="dxa"/>
@@ -44483,12 +43352,6 @@
         </w:tc>
       </w:tr>
       <w:tr>
-        <w:tblPrEx>
-          <w:tblCellMar>
-            <w:top w:w="0" w:type="dxa"/>
-            <w:bottom w:w="0" w:type="dxa"/>
-          </w:tblCellMar>
-        </w:tblPrEx>
         <w:tc>
           <w:tcPr>
             <w:tcW w:w="400" w:type="dxa"/>
@@ -44626,12 +43489,6 @@
         </w:tc>
       </w:tr>
       <w:tr>
-        <w:tblPrEx>
-          <w:tblCellMar>
-            <w:top w:w="0" w:type="dxa"/>
-            <w:bottom w:w="0" w:type="dxa"/>
-          </w:tblCellMar>
-        </w:tblPrEx>
         <w:tc>
           <w:tcPr>
             <w:tcW w:w="400" w:type="dxa"/>
@@ -44760,12 +43617,6 @@
         </w:tc>
       </w:tr>
       <w:tr>
-        <w:tblPrEx>
-          <w:tblCellMar>
-            <w:top w:w="0" w:type="dxa"/>
-            <w:bottom w:w="0" w:type="dxa"/>
-          </w:tblCellMar>
-        </w:tblPrEx>
         <w:tc>
           <w:tcPr>
             <w:tcW w:w="400" w:type="dxa"/>
@@ -44881,12 +43732,6 @@
         </w:tc>
       </w:tr>
       <w:tr>
-        <w:tblPrEx>
-          <w:tblCellMar>
-            <w:top w:w="0" w:type="dxa"/>
-            <w:bottom w:w="0" w:type="dxa"/>
-          </w:tblCellMar>
-        </w:tblPrEx>
         <w:tc>
           <w:tcPr>
             <w:tcW w:w="400" w:type="dxa"/>
@@ -44999,12 +43844,6 @@
         </w:tc>
       </w:tr>
       <w:tr>
-        <w:tblPrEx>
-          <w:tblCellMar>
-            <w:top w:w="0" w:type="dxa"/>
-            <w:bottom w:w="0" w:type="dxa"/>
-          </w:tblCellMar>
-        </w:tblPrEx>
         <w:tc>
           <w:tcPr>
             <w:tcW w:w="400" w:type="dxa"/>
@@ -45177,12 +44016,6 @@
         <w:gridCol w:w="2526"/>
       </w:tblGrid>
       <w:tr>
-        <w:tblPrEx>
-          <w:tblCellMar>
-            <w:top w:w="0" w:type="dxa"/>
-            <w:bottom w:w="0" w:type="dxa"/>
-          </w:tblCellMar>
-        </w:tblPrEx>
         <w:tc>
           <w:tcPr>
             <w:tcW w:w="2000" w:type="dxa"/>
@@ -45317,12 +44150,6 @@
         </w:tc>
       </w:tr>
       <w:tr>
-        <w:tblPrEx>
-          <w:tblCellMar>
-            <w:top w:w="0" w:type="dxa"/>
-            <w:bottom w:w="0" w:type="dxa"/>
-          </w:tblCellMar>
-        </w:tblPrEx>
         <w:tc>
           <w:tcPr>
             <w:tcW w:w="2000" w:type="dxa"/>
@@ -45429,12 +44256,6 @@
         </w:tc>
       </w:tr>
       <w:tr>
-        <w:tblPrEx>
-          <w:tblCellMar>
-            <w:top w:w="0" w:type="dxa"/>
-            <w:bottom w:w="0" w:type="dxa"/>
-          </w:tblCellMar>
-        </w:tblPrEx>
         <w:tc>
           <w:tcPr>
             <w:tcW w:w="2000" w:type="dxa"/>
@@ -45541,12 +44362,6 @@
         </w:tc>
       </w:tr>
       <w:tr>
-        <w:tblPrEx>
-          <w:tblCellMar>
-            <w:top w:w="0" w:type="dxa"/>
-            <w:bottom w:w="0" w:type="dxa"/>
-          </w:tblCellMar>
-        </w:tblPrEx>
         <w:tc>
           <w:tcPr>
             <w:tcW w:w="2000" w:type="dxa"/>
@@ -46156,6 +44971,7 @@
         <w:lang w:val="en-GB"/>
       </w:rPr>
     </w:pPr>
+    <w:proofErr w:type="spellStart"/>
     <w:r>
       <w:rPr>
         <w:i/>
@@ -46165,7 +44981,19 @@
         <w:szCs w:val="16"/>
         <w:lang w:val="en-GB"/>
       </w:rPr>
-      <w:t>FitManager AI Studio — Training Science Engine</w:t>
+      <w:t>FitManager</w:t>
+    </w:r>
+    <w:proofErr w:type="spellEnd"/>
+    <w:r>
+      <w:rPr>
+        <w:i/>
+        <w:iCs/>
+        <w:color w:val="95A5A6"/>
+        <w:sz w:val="16"/>
+        <w:szCs w:val="16"/>
+        <w:lang w:val="en-GB"/>
+      </w:rPr>
+      <w:t xml:space="preserve"> AI Studio — Training Science Engine</w:t>
     </w:r>
   </w:p>
 </w:hdr>

</xml_diff>